<commit_message>
Admin: «Γύροι κατανομής» opens the round view with the platform's data
- Allocation tab: new button (after an allocation) that opens
  /docs/gyroi-katanomis.html in a new tab and sends it, by same-origin
  postMessage, the R data package and the stored byStudent. The page
  warns when its rerun differs from the stored result (data changed
  after the allocation).
- Round view: club filter (one club through every round); 8 colours
  that repeat on days with more clubs.
- ui.js: api.bytes() for authenticated binary downloads.
- e2e: opens the view from the admin page, checks it loads without a
  warning and that the filter leaves one club.
- Help, manual-R, SPEC, WORKFLOW updated.

Co-Authored-By: Claude Opus 5.5 <noreply@anthropic.com>
Claude-Session: https://claude.ai/code/session_01WeDu77P1i2kYKaLY1AfNpo
</commit_message>
<xml_diff>
--- a/docs/Egxeiridio_R.docx
+++ b/docs/Egxeiridio_R.docx
@@ -3157,7 +3157,7 @@
         <w:pStyle w:val="FirstParagraph"/>
       </w:pPr>
       <w:r>
-        <w:t xml:space="preserve">Η σελίδα</w:t>
+        <w:t xml:space="preserve">Στην πλατφόρμα ανοίγει από την καρτέλα</w:t>
       </w:r>
       <w:r>
         <w:t xml:space="preserve"> </w:t>
@@ -3167,13 +3167,10 @@
           <w:b/>
           <w:bCs/>
         </w:rPr>
-        <w:t xml:space="preserve">«Η κατανομή γύρο-γύρο»</w:t>
-      </w:r>
-      <w:r>
-        <w:t xml:space="preserve"> </w:t>
-      </w:r>
-      <w:r>
-        <w:t xml:space="preserve">(</w:t>
+        <w:t xml:space="preserve">«Κατανομή» → «Γύροι κατανομής»</w:t>
+      </w:r>
+      <w:r>
+        <w:t xml:space="preserve">, με τα στοιχεία ήδη φορτωμένα. Χωρίς πλατφόρμα, η ίδια σελίδα (</w:t>
       </w:r>
       <w:r>
         <w:rPr>
@@ -3318,6 +3315,34 @@
       </w:r>
       <w:r>
         <w:t xml:space="preserve">(ΑΜ ή επώνυμο) επισημαίνει έναν μαθητή σε κάθε γύρο.</w:t>
+      </w:r>
+    </w:p>
+    <w:p>
+      <w:pPr>
+        <w:pStyle w:val="Compact"/>
+        <w:numPr>
+          <w:ilvl w:val="0"/>
+          <w:numId w:val="1007"/>
+        </w:numPr>
+      </w:pPr>
+      <w:r>
+        <w:t xml:space="preserve">Τα κουμπιά με τα ονόματα των ομίλων της ημέρας δείχνουν</w:t>
+      </w:r>
+      <w:r>
+        <w:t xml:space="preserve"> </w:t>
+      </w:r>
+      <w:r>
+        <w:rPr>
+          <w:b/>
+          <w:bCs/>
+        </w:rPr>
+        <w:t xml:space="preserve">έναν όμιλο</w:t>
+      </w:r>
+      <w:r>
+        <w:t xml:space="preserve"> </w:t>
+      </w:r>
+      <w:r>
+        <w:t xml:space="preserve">σε όλους τους γύρους· «Όλοι οι όμιλοι» τους ξαναδείχνει όλους. Τα χρώματα (πράσινο, μπλε, κόκκινο, κίτρινο, μωβ, τιρκουάζ, πορτοκαλί, ροζ) επαναλαμβάνονται όταν μια ημέρα έχει περισσότερους από 8 ομίλους· το όνομα είναι πάντα στην κεφαλίδα.</w:t>
       </w:r>
     </w:p>
     <w:p>

</xml_diff>